<commit_message>
Yayın bağlantıları eklendi; raporlar, doğrulamalar ve teslim paketi güncellendi
</commit_message>
<xml_diff>
--- a/reports/PredictiveMaint_AI_Rapor.docx
+++ b/reports/PredictiveMaint_AI_Rapor.docx
@@ -29,25 +29,25 @@
         <w:rPr>
           <w:b/>
         </w:rPr>
-        <w:t>Kod ve Notebook:</w:t>
+        <w:t>Kod ve Notebook (GitHub):</w:t>
       </w:r>
       <w:r>
         <w:rPr>
           <w:b w:val="0"/>
         </w:rPr>
-        <w:t xml:space="preserve"> Teslim paketindeki notebooks/PredictiveMaint_AI.ipynb (çalıştırılmış çıktılarıyla). </w:t>
+        <w:t xml:space="preserve"> https://github.com/TCoderr/PredictiveMaint-AI · </w:t>
       </w:r>
       <w:r>
         <w:rPr>
           <w:b/>
         </w:rPr>
-        <w:t>GitHub/Colab bağlantısı henüz yayımlanmadı</w:t>
+        <w:t>Colab'da aç:</w:t>
       </w:r>
       <w:r>
         <w:rPr>
           <w:b w:val="0"/>
         </w:rPr>
-        <w:t>; yazar yükledikten sonra buraya eklenecektir.</w:t>
+        <w:t xml:space="preserve"> https://colab.research.google.com/github/TCoderr/PredictiveMaint-AI/blob/main/notebooks/PredictiveMaint_AI.ipynb (notebook yerelde çalıştırıldı ve tekrarlanabilirliği doğrulandı; Colab'da çalıştırılması bu çalışmada doğrulanmadı).</w:t>
       </w:r>
     </w:p>
     <w:p>

</xml_diff>